<commit_message>
Align thesis numbering across formats
</commit_message>
<xml_diff>
--- a/paper/submission/graduation-research-ii/assignment-thesis.docx
+++ b/paper/submission/graduation-research-ii/assignment-thesis.docx
@@ -6778,7 +6778,7 @@
           <ns0:b/>
           <ns0:bCs/>
         </ns0:rPr>
-        <ns0:t xml:space="preserve">Endpoint composition diagnostic</ns0:t>
+        <ns0:t xml:space="preserve">Table 3. Endpoint fleet-composition diagnostic</ns0:t>
       </ns0:r>
     </ns0:p>
     <ns0:tbl>
@@ -8214,7 +8214,7 @@
           <ns0:b/>
           <ns0:bCs/>
         </ns0:rPr>
-        <ns0:t xml:space="preserve">Table 3. Consolidated entry specification audit</ns0:t>
+        <ns0:t xml:space="preserve">Table 4. Consolidated entry specification audit</ns0:t>
       </ns0:r>
     </ns0:p>
     <ns0:tbl>
@@ -9183,7 +9183,7 @@
           <ns0:b/>
           <ns0:bCs/>
         </ns0:rPr>
-        <ns0:t xml:space="preserve">Common-control cohort decomposition of log gross MWh/t</ns0:t>
+        <ns0:t xml:space="preserve">Table 5. Common-control cohort decomposition of log gross MWh/t</ns0:t>
       </ns0:r>
     </ns0:p>
     <ns0:tbl>
@@ -10012,6 +10012,18 @@
         <ns0:t xml:space="preserve">strongest statement supported by the evidence.</ns0:t>
       </ns0:r>
     </ns0:p>
+    <ns0:p>
+      <ns0:pPr>
+        <ns0:pStyle ns0:val="af"/>
+      </ns0:pPr>
+      <ns0:r>
+        <ns0:rPr>
+          <ns0:b/>
+          <ns0:bCs/>
+        </ns0:rPr>
+        <ns0:t xml:space="preserve">Table 6. Interpretive corrections produced by the three-margin design</ns0:t>
+      </ns0:r>
+    </ns0:p>
     <ns0:tbl>
       <ns0:tblPr>
         <ns0:tblStyle ns0:val="Table"/>
@@ -13004,7 +13016,7 @@
         <ns0:t xml:space="preserve"> </ns0:t>
       </ns0:r>
       <ns0:r>
-        <ns0:t xml:space="preserve">are omitted from Figure A1 because that category is too sparse and its timing is</ns0:t>
+        <ns0:t xml:space="preserve">are omitted from Figure A.1 because that category is too sparse and its timing is</ns0:t>
       </ns0:r>
       <ns0:r>
         <ns0:t xml:space="preserve"> </ns0:t>
@@ -13022,7 +13034,7 @@
           <ns1:inline>
             <ns1:extent cx="3486341" cy="2889993"/>
             <ns1:effectExtent b="0" l="0" r="0" t="0"/>
-            <ns1:docPr descr="Figure A1. Mean within-fiscal-year percentile ranks in the first complete year after reported entry for continuity-lineage entrants (n=27) and rebuild/replacement-like entrants (n=11). Metrics are gross MWh/t, generator design intensity (installed kW per t/day of processing capacity), and annual electrical capacity factor among engineering-valid generator-years; the dashed line marks the 50th percentile. The forward-dated/placeholder category (n=6) is omitted because support is sparse. All contrasts are descriptive." title="" id="60" name="Picture"/>
+            <ns1:docPr descr="Figure A.1. Mean within-fiscal-year percentile ranks in the first complete year after reported entry for continuity-lineage entrants (n=27) and rebuild/replacement-like entrants (n=11). Metrics are gross MWh/t, generator design intensity (installed kW per t/day of processing capacity), and annual electrical capacity factor among engineering-valid generator-years; the dashed line marks the 50th percentile. The forward-dated/placeholder category (n=6) is omitted because support is sparse. All contrasts are descriptive." title="" id="60" name="Picture"/>
             <ns2:graphic>
               <ns2:graphicData uri="http://schemas.openxmlformats.org/drawingml/2006/picture">
                 <ns3:pic>
@@ -13065,7 +13077,7 @@
         <ns0:pStyle ns0:val="ImageCaption"/>
       </ns0:pPr>
       <ns0:r>
-        <ns0:t xml:space="preserve">Figure A1. Mean within-fiscal-year percentile ranks in the first complete year after reported entry for continuity-lineage entrants (n=27) and rebuild/replacement-like entrants (n=11). Metrics are gross MWh/t, generator design intensity (installed kW per t/day of processing capacity), and annual electrical capacity factor among engineering-valid generator-years; the dashed line marks the 50th percentile. The forward-dated/placeholder category (n=6) is omitted because support is sparse. All contrasts are descriptive.</ns0:t>
+        <ns0:t xml:space="preserve">Figure A.1. Mean within-fiscal-year percentile ranks in the first complete year after reported entry for continuity-lineage entrants (n=27) and rebuild/replacement-like entrants (n=11). Metrics are gross MWh/t, generator design intensity (installed kW per t/day of processing capacity), and annual electrical capacity factor among engineering-valid generator-years; the dashed line marks the 50th percentile. The forward-dated/placeholder category (n=6) is omitted because support is sparse. All contrasts are descriptive.</ns0:t>
       </ns0:r>
     </ns0:p>
     <ns0:p>
@@ -13968,7 +13980,7 @@
         <ns0:t xml:space="preserve"> </ns0:t>
       </ns0:r>
       <ns0:r>
-        <ns0:t xml:space="preserve">at risk. Table B1 reports every non-intercept coefficient from the primary</ns0:t>
+        <ns0:t xml:space="preserve">at risk. Table B.1 reports every non-intercept coefficient from the primary</ns0:t>
       </ns0:r>
       <ns0:r>
         <ns0:t xml:space="preserve"> </ns0:t>
@@ -14224,7 +14236,7 @@
           <ns0:b/>
           <ns0:bCs/>
         </ns0:rPr>
-        <ns0:t xml:space="preserve">Table B1. Firth first-entry model focal coefficients</ns0:t>
+        <ns0:t xml:space="preserve">Table B.1. Firth first-entry model focal coefficients</ns0:t>
       </ns0:r>
     </ns0:p>
     <ns0:tbl>
@@ -15521,7 +15533,7 @@
         <ns0:t xml:space="preserve"> </ns0:t>
       </ns0:r>
       <ns0:r>
-        <ns0:t xml:space="preserve">interpreted separately because they are strongly correlated. Table B1 makes the</ns0:t>
+        <ns0:t xml:space="preserve">interpreted separately because they are strongly correlated. Table B.1 makes the</ns0:t>
       </ns0:r>
       <ns0:r>
         <ns0:t xml:space="preserve"> </ns0:t>
@@ -15611,7 +15623,7 @@
           <ns0:b/>
           <ns0:bCs/>
         </ns0:rPr>
-        <ns0:t xml:space="preserve">Table B2. Engineering model focal coefficients</ns0:t>
+        <ns0:t xml:space="preserve">Table B.2. Engineering model focal coefficients</ns0:t>
       </ns0:r>
     </ns0:p>
     <ns0:tbl>
@@ -16537,7 +16549,7 @@
         <ns0:pStyle ns0:val="af"/>
       </ns0:pPr>
       <ns0:r>
-        <ns0:t xml:space="preserve">Table B2 reports every focal coefficient used for the RQ3 interpretation.</ns0:t>
+        <ns0:t xml:space="preserve">Table B.2 reports every focal coefficient used for the RQ3 interpretation.</ns0:t>
       </ns0:r>
       <ns0:r>
         <ns0:t xml:space="preserve"> </ns0:t>
@@ -16561,7 +16573,7 @@
         <ns0:t xml:space="preserve"> </ns0:t>
       </ns0:r>
       <ns0:r>
-        <ns0:t xml:space="preserve">B1-B2 report the estimates needed to evaluate the three principal research</ns0:t>
+        <ns0:t xml:space="preserve">B.1-B.2 report the estimates needed to evaluate the three principal research</ns0:t>
       </ns0:r>
       <ns0:r>
         <ns0:t xml:space="preserve"> </ns0:t>

</xml_diff>